<commit_message>
Fase 3: cifras de cierre al corte de la medianoche del 24-10
Entro un pedido mas despues de generar el informe. Se actualizaron las cifras
en las secciones 5.5, 6, 10, 11, 12 y 14, en la tabla de validacion de reportes,
en la presentacion y en el LEEME: 64 pedidos por Q 21,576.00, ticket Q 337.13,
entregas en menos de 24 h 90.4 %, 65 facturas publicadas y 46 cobradas.
</commit_message>
<xml_diff>
--- a/Entrega_Fase3_Grupo14/1_Informe/Informe_Fase3_Grupo14_RutaMoto.docx
+++ b/Entrega_Fase3_Grupo14/1_Informe/Informe_Fase3_Grupo14_RutaMoto.docx
@@ -2595,7 +2595,7 @@
           <w:i w:val="0"/>
           <w:color w:val="000000"/>
         </w:rPr>
-        <w:t>La factura hereda del pedido el cliente, las líneas y los precios, y queda enlazada a él por el campo de origen, de modo que desde la factura se llega al pedido y desde el pedido a la factura sin buscar por el nombre del cliente ni por la fecha. Al cierre de la fase hay 64 facturas de cliente publicadas por Q 24,096.00, de las cuales 45 están cobradas.</w:t>
+        <w:t>La factura hereda del pedido el cliente, las líneas y los precios, y queda enlazada a él por el campo de origen, de modo que desde la factura se llega al pedido y desde el pedido a la factura sin buscar por el nombre del cliente ni por la fecha. Al cierre de la fase hay 65 facturas de cliente publicadas por Q 24,306.00, de las cuales 46 están cobradas.</w:t>
       </w:r>
     </w:p>
     <w:p>
@@ -3354,7 +3354,7 @@
                 <w:i w:val="0"/>
                 <w:color w:val="000000"/>
               </w:rPr>
-              <w:t>Sí. 64 facturas publicadas por Q 24,096.00, 45 de ellas cobradas</w:t>
+              <w:t>Sí. 65 facturas publicadas por Q 24,306.00, 46 de ellas cobradas</w:t>
             </w:r>
           </w:p>
         </w:tc>
@@ -3450,7 +3450,7 @@
                 <w:i w:val="0"/>
                 <w:color w:val="000000"/>
               </w:rPr>
-              <w:t>Sí. Al validar las entregas bajó la existencia real: 624 unidades al cierre</w:t>
+              <w:t>Sí. Al validar las entregas bajó la existencia real: 622 unidades al cierre</w:t>
             </w:r>
           </w:p>
         </w:tc>
@@ -9474,7 +9474,7 @@
           <w:i w:val="0"/>
           <w:color w:val="000000"/>
         </w:rPr>
-        <w:t>El plan preveía 38 productos publicados y ninguno en cero; al cierre Odoo muestra 38 productos y ninguno en cero, con 624 unidades en total. Las barras dejan ver que el inventario está concentrado en los lubricantes y los filtros, que son los productos de rotación alta del caso.</w:t>
+        <w:t>El plan preveía 38 productos publicados y ninguno en cero; al cierre Odoo muestra 38 productos y ninguno en cero, con 622 unidades en total. Las barras dejan ver que el inventario está concentrado en los lubricantes y los filtros, que son los productos de rotación alta del caso.</w:t>
       </w:r>
     </w:p>
     <w:p>
@@ -9606,7 +9606,7 @@
           <w:i w:val="0"/>
           <w:color w:val="000000"/>
         </w:rPr>
-        <w:t>La vista por día muestra la historia simulada repartida entre el 5 y el 20 de octubre y el pico del 24 de octubre, que son los doce pedidos del sitio concentrados en la jornada de pruebas. La vista por semana y por mes resume lo mismo: Q 21,366.00 con impuesto incluido en 63 pedidos confirmados, de los cuales Q 20,961.00 corresponden a octubre.</w:t>
+        <w:t>La vista por día muestra la historia simulada repartida entre el 5 y el 20 de octubre y el pico del 24 de octubre, que son los doce pedidos del sitio concentrados en la jornada de pruebas. La vista por semana y por mes resume lo mismo: Q 21,576.00 con impuesto incluido en 64 pedidos confirmados, de los cuales Q 21,171.00 corresponden a octubre.</w:t>
       </w:r>
     </w:p>
     <w:p>
@@ -9695,7 +9695,7 @@
           <w:i w:val="0"/>
           <w:color w:val="000000"/>
         </w:rPr>
-        <w:t>El reporte separa los tres canales: ventas directas por WhatsApp y teléfono, con 45 pedidos y Q 14,679.50 de venta y Q 3,781.67 de margen; el sitio web, con 13 pedidos y Q 4,571.50 de venta y Q 1,217.69 de margen; y el equipo de ventas por omisión, con los cinco pedidos que venían de la Fase 2 por Q 2,115.00. El margen total de la fase es de Q 5,419.76 sobre Q 21,366.00 de venta, un 25.4 %.</w:t>
+        <w:t>El reporte separa los tres canales: ventas directas por WhatsApp y teléfono, con 45 pedidos y Q 14,679.50 de venta y Q 3,781.67 de margen; el sitio web, con 13 pedidos y Q 4,571.50 de venta y Q 1,217.69 de margen; y el equipo de ventas por omisión, con seis pedidos que vienen de la Fase 2 por Q 2,325.00. El margen total de la fase es de Q 5,477.26 sobre Q 21,576.00 de venta, un 25.4 %.</w:t>
       </w:r>
     </w:p>
     <w:p>
@@ -10055,7 +10055,7 @@
                 <w:i w:val="0"/>
                 <w:color w:val="000000"/>
               </w:rPr>
-              <w:t>Q 21,366.00 con 63 pedidos</w:t>
+              <w:t>Q 21,576.00 con 64 pedidos</w:t>
             </w:r>
           </w:p>
         </w:tc>
@@ -10171,7 +10171,7 @@
                 <w:i w:val="0"/>
                 <w:color w:val="000000"/>
               </w:rPr>
-              <w:t>Q 5,419.76, 25.4 % de la venta</w:t>
+              <w:t>Q 5,477.26, 25.4 % de la venta</w:t>
             </w:r>
           </w:p>
         </w:tc>
@@ -10206,7 +10206,7 @@
           <w:i w:val="0"/>
           <w:color w:val="000000"/>
         </w:rPr>
-        <w:t>Los números de este apartado se leyeron de los informes de Odoo al cierre de la fase, el 24 de octubre de 2026, y no del Excel de plan. Donde el resultado difiere del plan se explica la razón.</w:t>
+        <w:t>Los números de este apartado se leyeron de los informes de Odoo al cierre de la fase, la medianoche del 24 de octubre de 2026, y no del Excel de plan. Donde el resultado difiere del plan se explica la razón.</w:t>
       </w:r>
     </w:p>
     <w:p>
@@ -10508,7 +10508,7 @@
                 <w:i w:val="0"/>
                 <w:color w:val="000000"/>
               </w:rPr>
-              <w:t>Q 339.14</w:t>
+              <w:t>Q 337.13</w:t>
             </w:r>
           </w:p>
         </w:tc>
@@ -10528,7 +10528,7 @@
                 <w:color w:val="000000"/>
                 <w:sz w:val="20"/>
               </w:rPr>
-              <w:t>Ventas › Informes: Q 21,366.00 entre 63 pedidos confirmados</w:t>
+              <w:t>Ventas › Informes: Q 21,576.00 entre 64 pedidos confirmados</w:t>
             </w:r>
           </w:p>
         </w:tc>
@@ -10611,7 +10611,7 @@
                 <w:i w:val="0"/>
                 <w:color w:val="000000"/>
               </w:rPr>
-              <w:t>90.2 %</w:t>
+              <w:t>90.4 %</w:t>
             </w:r>
           </w:p>
         </w:tc>
@@ -10631,7 +10631,7 @@
                 <w:color w:val="000000"/>
                 <w:sz w:val="20"/>
               </w:rPr>
-              <w:t>Entregas validadas: 46 de 51, fecha del pedido frente a fecha efectiva</w:t>
+              <w:t>Entregas validadas: 47 de 52, fecha del pedido frente a fecha efectiva</w:t>
             </w:r>
           </w:p>
         </w:tc>
@@ -11352,7 +11352,7 @@
                 <w:i w:val="0"/>
                 <w:color w:val="000000"/>
               </w:rPr>
-              <w:t>Cumplido. Las 51 entregas validadas descontaron existencia sobre la misma base; ningún producto quedó en cero y solo dos quedaron bajo su mínimo.</w:t>
+              <w:t>Cumplido. Las 52 entregas validadas descontaron existencia sobre la misma base; ningún producto quedó en cero y solo dos quedaron bajo su mínimo.</w:t>
             </w:r>
           </w:p>
         </w:tc>
@@ -11515,7 +11515,7 @@
                 <w:i w:val="0"/>
                 <w:color w:val="000000"/>
               </w:rPr>
-              <w:t>Cumplido a medias. Las entregas en menos de 24 horas llegaron al 90.2 %. El CSAT no se midió porque no se implementó la encuesta postventa.</w:t>
+              <w:t>Cumplido a medias. Las entregas en menos de 24 horas llegaron al 90.4 %. El CSAT no se midió porque no se implementó la encuesta postventa.</w:t>
             </w:r>
           </w:p>
         </w:tc>
@@ -12256,7 +12256,7 @@
           <w:i w:val="0"/>
           <w:color w:val="000000"/>
         </w:rPr>
-        <w:t>Las metas operativas de la Fase 1 se cumplen. El ticket promedio cerró en Q 339.14 contra una meta de Q 285, la recompra en 29.8 % contra 20 %, las entregas en menos de 24 horas en 90.2 % contra 90 %, y el quiebre de stock en cero de 38 productos contra un máximo tolerado del 5 %. Los cuatro salen de movimientos registrados en el ERP y no de una estimación.</w:t>
+        <w:t>Las metas operativas de la Fase 1 se cumplen. El ticket promedio cerró en Q 337.13 contra una meta de Q 285, la recompra en 29.8 % contra 20 %, las entregas en menos de 24 horas en 90.4 % contra 90 %, y el quiebre de stock en cero de 38 productos contra un máximo tolerado del 5 %. Los cuatro salen de movimientos registrados en el ERP y no de una estimación.</w:t>
       </w:r>
     </w:p>
     <w:p>
@@ -12274,7 +12274,7 @@
           <w:i w:val="0"/>
           <w:color w:val="000000"/>
         </w:rPr>
-        <w:t>El inventario dejó de ser una hoja aparte. Las 51 entregas validadas movieron la existencia sobre la misma base que lee la tienda, y por eso la tienda deja de vender un producto en cuanto llega a cero sin que nadie lo marque a mano. El reporte de reabastecimiento muestra dos productos bajo su mínimo, ELE-002 y CAS-005, que es la señal que el encargado de compras necesita para reponer.</w:t>
+        <w:t>El inventario dejó de ser una hoja aparte. Las 52 entregas validadas movieron la existencia sobre la misma base que lee la tienda, y por eso la tienda deja de vender un producto en cuanto llega a cero sin que nadie lo marque a mano. El reporte de reabastecimiento muestra dos productos bajo su mínimo, ELE-002 y CAS-005, que es la señal que el encargado de compras necesita para reponer.</w:t>
       </w:r>
     </w:p>
     <w:p>

</xml_diff>